<commit_message>
Rename student/author to Akshat Dubey across deliverables
Update report, README, SQL headers, DAG owner, pyproject metadata,
and submission zip to Assignment_3_Akshat_Dubey.zip.

Co-authored-by: rohan.chaudhary <rohan.chaudhary@student.uts.edu.au>
</commit_message>
<xml_diff>
--- a/docs/Assignment_3_Handover_Report.docx
+++ b/docs/Assignment_3_Handover_Report.docx
@@ -7,7 +7,7 @@
         <w:pStyle w:val="Title"/>
       </w:pPr>
       <w:r>
-        <w:t>Assignment 3 Handover Report – Rohan Chaudhary</w:t>
+        <w:t>Assignment 3 Handover Report – Akshat Dubey</w:t>
       </w:r>
     </w:p>
     <w:p>
@@ -20,7 +20,7 @@
     </w:p>
     <w:p>
       <w:r>
-        <w:t xml:space="preserve">Student: Rohan Chaudhary  </w:t>
+        <w:t xml:space="preserve">Student: Akshat Dubey  </w:t>
         <w:br/>
         <w:t xml:space="preserve">Unit: Big Data Engineering  </w:t>
         <w:br/>
@@ -335,7 +335,7 @@
         <w:br/>
         <w:t>- data/ reference extracts + listings schema note</w:t>
         <w:br/>
-        <w:t>- Submission zip: Assignment_3_Rohan_Chaudhary.zip</w:t>
+        <w:t>- Submission zip: Assignment_3_Akshat_Dubey.zip</w:t>
       </w:r>
     </w:p>
     <w:p>

</xml_diff>

<commit_message>
Add Composer-optimised Bronze DAG v2 (COPY + Variables)
Introduce airbnb_sydney_elt_dag_v2 with Postgres COPY loads, Airflow
Variables for bucket/month/truncate, parallel static loads, and a
short Composer run guide. Refresh submission zip.

Co-authored-by: rohan.chaudhary <rohan.chaudhary@student.uts.edu.au>
</commit_message>
<xml_diff>
--- a/docs/Assignment_3_Handover_Report.docx
+++ b/docs/Assignment_3_Handover_Report.docx
@@ -83,9 +83,9 @@
         <w:br/>
         <w:t>2. Upload data folders to the Composer GCS bucket.</w:t>
         <w:br/>
-        <w:t>3. Deploy `dags/airbnb_sydney_elt_dag.py`, set `BUCKET_NAME` and Postgres connection `postgres_bde`.</w:t>
+        <w:t>3. Deploy **`dags/airbnb_sydney_elt_dag_v2.py`** (preferred; COPY + Variables). Set connection `postgres_bde` and Variables `airbnb_gcs_bucket`, `airbnb_truncate`, `airbnb_load_month` (see `docs/dag-run-smoother.md`). Pause legacy `airbnb_sydney_elt_dag.py` if both are present.</w:t>
         <w:br/>
-        <w:t>4. Trigger the DAG once: truncate → load static files → load 12 months in order.</w:t>
+        <w:t>4. First run: `airbnb_truncate=true`, load `05_2020` or `all`. Later months: `airbnb_truncate=false`, set `airbnb_load_month` to the next stem — no DAG re-upload.</w:t>
       </w:r>
     </w:p>
     <w:p>

</xml_diff>

<commit_message>
Align Assignment 3 pack to working airbnb_census_elt DAG
Use bronze.raw_* tables and postgres connection from the Composer DAG
that already runs. Update part_1.sql, dbt sources/silver (TEXT casts,
G01 column subset), docs/run guide, and submission zip; deprecate
sydney_* DAG stubs.

Co-authored-by: rohan.chaudhary <rohan.chaudhary@student.uts.edu.au>
</commit_message>
<xml_diff>
--- a/docs/Assignment_3_Handover_Report.docx
+++ b/docs/Assignment_3_Handover_Report.docx
@@ -47,7 +47,7 @@
     </w:p>
     <w:p>
       <w:r>
-        <w:t>Airflow does not call dbt. After each chronological monthly load, run dbt snapshot then dbt run in dbt Cloud so SCD2 history accumulates correctly.</w:t>
+        <w:t>Airflow does not call dbt. After each monthly trigger, run silver entities → dbt snapshot → dbt run so SCD2 history accumulates.</w:t>
       </w:r>
     </w:p>
     <w:p>
@@ -79,13 +79,13 @@
       <w:r>
         <w:t>Part 1 – Bronze + Airflow</w:t>
         <w:br/>
-        <w:t>1. Execute `part_1.sql` to create `bronze` tables (`listings_raw`, `census_g01_raw`, `census_g02_raw`, `lga_code_raw`, `lga_suburb_raw`).</w:t>
+        <w:t>1. Upload files under Composer `data/` (listings, Census LGA, NSW_LGA). Connection id: **`postgres`**.</w:t>
         <w:br/>
-        <w:t>2. Upload data folders to the Composer GCS bucket.</w:t>
+        <w:t>2. Deploy **`dags/airbnb_census_elt_dag.py`** only (`dag_id=airbnb_census_elt_bronze_load`). It creates `bronze.raw_*` tables and loads via COPY. `part_1.sql` mirrors the same DDL for marking.</w:t>
         <w:br/>
-        <w:t>3. Deploy **`dags/airbnb_sydney_elt_dag_v2.py`** (preferred; COPY + Variables). Set connection `postgres_bde` and Variables `airbnb_gcs_bucket`, `airbnb_truncate`, `airbnb_load_month` (see `docs/dag-run-smoother.md`). Pause legacy `airbnb_sydney_elt_dag.py` if both are present.</w:t>
+        <w:t>3. Trigger with `{}` → loads `05_2020.csv`. Verify: `SELECT COUNT(*) FROM bronze.raw_listings;`.</w:t>
         <w:br/>
-        <w:t>4. First run: `airbnb_truncate=true`, load `05_2020` or `all`. Later months: `airbnb_truncate=false`, set `airbnb_load_month` to the next stem — no DAG re-upload.</w:t>
+        <w:t>4. See `docs/dag-run-smoother.md` for the full runbook.</w:t>
       </w:r>
     </w:p>
     <w:p>
@@ -169,7 +169,7 @@
       <w:r>
         <w:t>Part 3 – Remaining months</w:t>
         <w:br/>
-        <w:t>The same DAG loads months sequentially. Operationally: after each month lands in Bronze, manually run dbt snapshots + models before the next month so SCD2 versions align with scrape time.</w:t>
+        <w:t>Re-trigger the **same** DAG with `{"month":"06_2020"}` … `{"month":"04_2021"}` in order. Each run reloads Census/LGA references and replaces that month’s listings by `source_file`. After each success: silver → snapshot → run in dbt Cloud.</w:t>
       </w:r>
     </w:p>
     <w:p>
@@ -329,9 +329,11 @@
       <w:r>
         <w:t>- part_1.sql, part_4.sql</w:t>
         <w:br/>
-        <w:t>- dags/airbnb_sydney_elt_dag.py</w:t>
+        <w:t>- dags/airbnb_census_elt_dag.py (submission); sydney_* DAG files are deprecated stubs</w:t>
         <w:br/>
         <w:t>- dbt_airbnb/models/{bronze,silver,gold,datamart}, dbt_airbnb/snapshots/, dbt_airbnb/dbt_project.yml</w:t>
+        <w:br/>
+        <w:t>- docs/dag-run-smoother.md – trigger conf + dbt order</w:t>
         <w:br/>
         <w:t>- data/ reference extracts + listings schema note</w:t>
         <w:br/>
@@ -343,14 +345,14 @@
         <w:pStyle w:val="Heading2"/>
       </w:pPr>
       <w:r>
-        <w:t>7. What still needs a live GCP / dbt Cloud run</w:t>
+        <w:t>7. Live verification on Composer / dbt Cloud</w:t>
       </w:r>
     </w:p>
     <w:p>
       <w:r>
-        <w:t xml:space="preserve">1. Upload 12 Airbnb month files; set Composer bucket name + Postgres connection.  </w:t>
+        <w:t xml:space="preserve">1. Confirm DAG already loads: SELECT COUNT(*) FROM bronze.raw_listings; and counts by source_file.  </w:t>
         <w:br/>
-        <w:t xml:space="preserve">2. Execute DAG; run dbt snapshot/run (optionally month-by-month).  </w:t>
+        <w:t xml:space="preserve">2. Trigger remaining months via {"month":"MM_YYYY"}; after each: silver → snapshot → run.  </w:t>
         <w:br/>
         <w:t xml:space="preserve">3. Execute part_4.sql; paste result screenshots into this report before Canvas submit.  </w:t>
         <w:br/>

</xml_diff>

<commit_message>
Fix Part 4a/4c to top/bottom 3 LGAs and top 5 neighbourhoods
Align part_4.sql and handover wording with the clean brief; refresh
submission zip.

Co-authored-by: rohan.chaudhary <rohan.chaudhary@student.uts.edu.au>
</commit_message>
<xml_diff>
--- a/docs/Assignment_3_Handover_Report.docx
+++ b/docs/Assignment_3_Handover_Report.docx
@@ -208,12 +208,12 @@
         <w:pStyle w:val="Heading3"/>
       </w:pPr>
       <w:r>
-        <w:t>4a – Top 13 vs bottom 13 LGAs (revenue per active listing, last 12 months)</w:t>
+        <w:t>4a – Top 3 vs bottom 3 LGAs (revenue per active listing, last 12 months)</w:t>
       </w:r>
     </w:p>
     <w:p>
       <w:r>
-        <w:t>Method: Average estimated_revenue for active listings by lga_code over the last 12 months; rank; compare Census age shares and average_household_size for top 13 vs bottom 13.</w:t>
+        <w:t>Method: Average estimated_revenue for active listings by lga_code over the last 12 months; rank; compare Census age shares and average_household_size for top 3 vs bottom 3.</w:t>
       </w:r>
     </w:p>
     <w:p>

</xml_diff>

<commit_message>
Part 4: neighbourhood-grain 4b, labels on 4d, coverage_rank on 4e
Align part_4.sql and handover with clean brief: 4b corr across
listing_neighbourhoods (scatter + scalar); clearer 4d labels; 4e
coverage_rank. Refresh submission zip.

Co-authored-by: rohan.chaudhary <rohan.chaudhary@student.uts.edu.au>
</commit_message>
<xml_diff>
--- a/docs/Assignment_3_Handover_Report.docx
+++ b/docs/Assignment_3_Handover_Report.docx
@@ -213,17 +213,17 @@
     </w:p>
     <w:p>
       <w:r>
-        <w:t>Method: Average estimated_revenue for active listings by lga_code over the last 12 months; rank; compare Census age shares and average_household_size for top 3 vs bottom 3.</w:t>
+        <w:t>Method: Average estimated_revenue for active listings by lga_code over the last 12 months; dense_rank top/bottom 3; return one ranked row per LGA with Census age shares (pct_age_0_14, pct_age_15_64, pct_age_65_plus), average_household_size, and median_age_persons.</w:t>
       </w:r>
     </w:p>
     <w:p>
       <w:r>
-        <w:t>Expected insight pattern: Higher-revenue Sydney LGAs (often eastern/harbour councils) tend to show different age mixes and household sizes than lower-revenue outer LGAs—compare % 0–14, % 15–64, % 65+, and mean household size between groups. Report the LGA name lists from the query lgas column as evidence.</w:t>
+        <w:t>Expected insight pattern: Compare Top ranks 1–3 vs Bottom ranks 1–3 on age mix and household size. Higher-revenue Sydney LGAs often differ from outer lower-revenue councils.</w:t>
       </w:r>
     </w:p>
     <w:p>
       <w:r>
-        <w:t>Recommendation: Target host acquisition and pricing guidance toward LGAs whose demographics align with high guest spend, while monitoring housing-pressure communities in the bottom cohort.</w:t>
+        <w:t>Recommendation: Target host acquisition toward demographics that align with high guest spend; monitor housing pressure in the bottom cohort.</w:t>
       </w:r>
     </w:p>
     <w:p>
@@ -231,12 +231,12 @@
         <w:pStyle w:val="Heading3"/>
       </w:pPr>
       <w:r>
-        <w:t>4b – Correlation: median age vs revenue per active listing</w:t>
+        <w:t>4b – Correlation: neighbourhood median age vs revenue per active listing</w:t>
       </w:r>
     </w:p>
     <w:p>
       <w:r>
-        <w:t>Method: corr(median_age_persons, avg_revenue_per_active_listing) across LGAs joined to ref_census_g02.</w:t>
+        <w:t>Method: Grain = listing_neighbourhood. Avg estimated revenue per active listing by neighbourhood; map neighbourhood → LGA → Census G02 median_age_persons (LGA median age as neighbourhood proxy). 4b-i ranked neighbourhood detail; 4b-ii corr(median_age, avg_revenue) across neighbourhoods.</w:t>
       </w:r>
     </w:p>
     <w:p>
@@ -245,14 +245,14 @@
         <w:br/>
         <w:t xml:space="preserve">- |r| &amp;lt; 0.3 → weak; age alone is a poor predictor.  </w:t>
         <w:br/>
-        <w:t xml:space="preserve">- Positive r → older LGAs earn more per active listing.  </w:t>
+        <w:t xml:space="preserve">- Positive r → older neighbourhoods earn more per active listing.  </w:t>
         <w:br/>
-        <w:t>- Negative r → younger LGAs earn more.</w:t>
+        <w:t>- Negative r → younger neighbourhoods earn more.</w:t>
       </w:r>
     </w:p>
     <w:p>
       <w:r>
-        <w:t>State the coefficient from the live query and avoid claiming causation (amenities, tourism, dwelling mix confound age).</w:t>
+        <w:t>State the live coefficient; do not claim causation.</w:t>
       </w:r>
     </w:p>
     <w:p>
@@ -260,17 +260,17 @@
         <w:pStyle w:val="Heading3"/>
       </w:pPr>
       <w:r>
-        <w:t>4c – Best listing type for top 15 neighbourhoods (max stays)</w:t>
+        <w:t>4c – Best listing type for top 5 neighbourhoods (max stays)</w:t>
       </w:r>
     </w:p>
     <w:p>
       <w:r>
-        <w:t>Method: Identify top 15 listing_neighbourhood by avg estimated revenue per active listing; within each, pick (property_type, room_type, accommodates) with maximum sum(number_of_stays).</w:t>
+        <w:t>Method: Top 5 listing_neighbourhood by avg estimated revenue (neighbourhood_rank 1–5); within each, pick (property_type, room_type, accommodates) with maximum sum(number_of_stays).</w:t>
       </w:r>
     </w:p>
     <w:p>
       <w:r>
-        <w:t>Recommendation: For each high-revenue neighbourhood, promote the winning capacity/room mix (often entire-home mid-capacity in Sydney coastal LGAs) in host onboarding guides.</w:t>
+        <w:t>Recommendation: Promote the winning capacity/room mix for each high-revenue neighbourhood in host onboarding.</w:t>
       </w:r>
     </w:p>
     <w:p>
@@ -283,12 +283,12 @@
     </w:p>
     <w:p>
       <w:r>
-        <w:t>Method: Hosts with &amp;gt;1 distinct listing_id; count distinct lga_code. Report % with n_lgas = 1 vs n_lgas &gt; 1.</w:t>
+        <w:t>Method: Hosts with &amp;gt;1 distinct listing_id; label each Concentrated (same LGA) vs Distributed (multiple LGAs); report counts and percentages.</w:t>
       </w:r>
     </w:p>
     <w:p>
       <w:r>
-        <w:t>Interpretation: A high concentration share means multi-property hosts specialise locally (portfolio risk tied to one council’s rules); a high distributed share implies geographic diversification across Sydney LGAs.</w:t>
+        <w:t>Interpretation: High concentration → local specialisation; high distribution → geographic diversification across Sydney LGAs.</w:t>
       </w:r>
     </w:p>
     <w:p>
@@ -301,12 +301,12 @@
     </w:p>
     <w:p>
       <w:r>
-        <w:t>Method: Hosts with exactly one listing; sum active estimated revenue over last 12 months; compare to median_mortgage_repay_monthly * 12 from Census G02; rank LGAs by % covering (min 10 hosts).</w:t>
+        <w:t>Method: Hosts with exactly one listing; sum active estimated revenue over last 12 months; compare to median_mortgage_repay_monthly * 12; rank LGAs by % covering (coverage_rank, min 10 hosts).</w:t>
       </w:r>
     </w:p>
     <w:p>
       <w:r>
-        <w:t>Recommendation: Highlight the top LGA(s) where a single Airbnb listing most often covers the local median mortgage annualisation—useful for “host affordability” messaging—while noting Census medians are 2016 and revenue is an occupancy proxy, not net income.</w:t>
+        <w:t>Recommendation: Highlight the highest coverage_rank LGA(s) for host-affordability messaging; note Census medians are 2016 and revenue is an occupancy proxy, not net income.</w:t>
       </w:r>
     </w:p>
     <w:p>

</xml_diff>